<commit_message>
adding gsm_internet text file
</commit_message>
<xml_diff>
--- a/This article shows how to get internet to Beagle Bone Black.docx
+++ b/This article shows how to get internet to Beagle Bone Black.docx
@@ -4,13 +4,7 @@
   <w:body>
     <w:p>
       <w:r>
-        <w:t>This article shows how to get internet to Beagle Bone Black</w:t>
-      </w:r>
-      <w:r>
-        <w:t xml:space="preserve"> </w:t>
-      </w:r>
-      <w:r>
-        <w:t>(BBB) connected via USB cable.</w:t>
+        <w:t>This article shows how to get internet to Beagle Bone Black (BBB) connected via USB cable.</w:t>
       </w:r>
     </w:p>
     <w:p/>
@@ -26,14 +20,7 @@
           <w:b/>
           <w:bCs/>
         </w:rPr>
-        <w:t>How to get internet for the Beagle Bone Black</w:t>
-      </w:r>
-      <w:r>
-        <w:rPr>
-          <w:b/>
-          <w:bCs/>
-        </w:rPr>
-        <w:t xml:space="preserve"> -&gt; </w:t>
+        <w:t xml:space="preserve">How to get internet for the Beagle Bone Black -&gt; </w:t>
       </w:r>
       <w:hyperlink r:id="rId5" w:history="1">
         <w:r>
@@ -42,23 +29,7 @@
             <w:b/>
             <w:bCs/>
           </w:rPr>
-          <w:t>Link to getting</w:t>
-        </w:r>
-        <w:r>
-          <w:rPr>
-            <w:rStyle w:val="Hyperlink"/>
-            <w:b/>
-            <w:bCs/>
-          </w:rPr>
-          <w:t xml:space="preserve"> </w:t>
-        </w:r>
-        <w:r>
-          <w:rPr>
-            <w:rStyle w:val="Hyperlink"/>
-            <w:b/>
-            <w:bCs/>
-          </w:rPr>
-          <w:t>Internet</w:t>
+          <w:t>Link to getting Internet</w:t>
         </w:r>
       </w:hyperlink>
     </w:p>
@@ -96,7 +67,49 @@
           <w:b/>
           <w:bCs/>
         </w:rPr>
-        <w:t>This is for your internet connection adapter settings -&gt; enable the sharing and in the dropdown select the Beagle bone adapter, for me it is Ethernet 2.</w:t>
+        <w:t>This is for your internet connection</w:t>
+      </w:r>
+      <w:r>
+        <w:rPr>
+          <w:b/>
+          <w:bCs/>
+        </w:rPr>
+        <w:t xml:space="preserve"> </w:t>
+      </w:r>
+      <w:r>
+        <w:rPr>
+          <w:b/>
+          <w:bCs/>
+        </w:rPr>
+        <w:t xml:space="preserve">adapter settings </w:t>
+      </w:r>
+      <w:r>
+        <w:rPr>
+          <w:b/>
+          <w:bCs/>
+        </w:rPr>
+        <w:t xml:space="preserve">(for me I’m getting internet through </w:t>
+      </w:r>
+      <w:r>
+        <w:rPr>
+          <w:b/>
+          <w:bCs/>
+        </w:rPr>
+        <w:t>WIFI</w:t>
+      </w:r>
+      <w:r>
+        <w:rPr>
+          <w:b/>
+          <w:bCs/>
+        </w:rPr>
+        <w:t>)</w:t>
+      </w:r>
+      <w:r>
+        <w:rPr>
+          <w:b/>
+          <w:bCs/>
+        </w:rPr>
+        <w:t xml:space="preserve"> -&gt; enable the sharing and in the dropdown select the Beagle bone adapter, for me it is Ethernet 2.</w:t>
       </w:r>
     </w:p>
     <w:p>
@@ -170,7 +183,6 @@
         <w:rPr>
           <w:noProof/>
         </w:rPr>
-        <w:lastRenderedPageBreak/>
         <w:drawing>
           <wp:anchor distT="0" distB="0" distL="114300" distR="114300" simplePos="0" relativeHeight="251658240" behindDoc="1" locked="0" layoutInCell="1" allowOverlap="1" wp14:anchorId="6955DBD0" wp14:editId="529E9445">
             <wp:simplePos x="0" y="0"/>
@@ -404,13 +416,7 @@
     </w:p>
     <w:p>
       <w:r>
-        <w:t xml:space="preserve">Save and exit (Ctrl + O, </w:t>
-      </w:r>
-      <w:r>
-        <w:t>enter,</w:t>
-      </w:r>
-      <w:r>
-        <w:t xml:space="preserve"> Ctrl + X)</w:t>
+        <w:t>Save and exit (Ctrl + O, enter, Ctrl + X)</w:t>
       </w:r>
     </w:p>
     <w:p>

</xml_diff>